<commit_message>
Index / Background randomizer
</commit_message>
<xml_diff>
--- a/blog-module/blog-entries/20260327J/BetCast262.docx
+++ b/blog-module/blog-entries/20260327J/BetCast262.docx
@@ -9,14 +9,12 @@
           <w:lang w:val="el-GR"/>
         </w:rPr>
       </w:pPr>
-      <w:proofErr w:type="spellStart"/>
       <w:r>
         <w:rPr>
           <w:lang w:val="de-DE"/>
         </w:rPr>
         <w:t>BetCast</w:t>
       </w:r>
-      <w:proofErr w:type="spellEnd"/>
       <w:r>
         <w:rPr>
           <w:lang w:val="el-GR"/>
@@ -45,14 +43,12 @@
           <w:lang w:val="el-GR"/>
         </w:rPr>
       </w:pPr>
-      <w:proofErr w:type="spellStart"/>
       <w:r>
         <w:rPr>
           <w:lang w:val="de-DE"/>
         </w:rPr>
         <w:t>BetCast</w:t>
       </w:r>
-      <w:proofErr w:type="spellEnd"/>
       <w:r>
         <w:rPr>
           <w:lang w:val="el-GR"/>
@@ -94,7 +90,7 @@
       <w:pPr>
         <w:pStyle w:val="Textbody"/>
         <w:rPr>
-          <w:lang w:val="el-GR"/>
+          <w:lang w:val="de-DE"/>
         </w:rPr>
       </w:pPr>
       <w:r>
@@ -108,64 +104,14 @@
           <w:lang w:val="el-GR"/>
         </w:rPr>
         <w:br/>
-        <w:t xml:space="preserve">Τα </w:t>
-      </w:r>
-      <w:proofErr w:type="spellStart"/>
-      <w:r>
-        <w:rPr>
-          <w:lang w:val="el-GR"/>
-        </w:rPr>
-        <w:t>σημεια</w:t>
-      </w:r>
-      <w:proofErr w:type="spellEnd"/>
-      <w:r>
-        <w:rPr>
-          <w:lang w:val="el-GR"/>
-        </w:rPr>
-        <w:t xml:space="preserve"> που σας </w:t>
-      </w:r>
-      <w:proofErr w:type="spellStart"/>
-      <w:r>
-        <w:rPr>
-          <w:lang w:val="el-GR"/>
-        </w:rPr>
-        <w:t>δινω</w:t>
-      </w:r>
-      <w:proofErr w:type="spellEnd"/>
-      <w:r>
-        <w:rPr>
-          <w:lang w:val="el-GR"/>
-        </w:rPr>
-        <w:t xml:space="preserve"> για αυτό το </w:t>
-      </w:r>
-      <w:proofErr w:type="spellStart"/>
-      <w:r>
-        <w:rPr>
-          <w:lang w:val="el-GR"/>
-        </w:rPr>
-        <w:t>αγωνιστικο</w:t>
-      </w:r>
-      <w:proofErr w:type="spellEnd"/>
+        <w:t>Τα σημεια που σας δινω για αυτό το αγωνιστικο ΠΣΚ</w:t>
+      </w:r>
       <w:r>
         <w:rPr>
           <w:lang w:val="el-GR"/>
         </w:rPr>
         <w:t xml:space="preserve"> </w:t>
       </w:r>
-      <w:proofErr w:type="spellStart"/>
-      <w:r>
-        <w:rPr>
-          <w:lang w:val="el-GR"/>
-        </w:rPr>
-        <w:t>ΠΣΚ</w:t>
-      </w:r>
-      <w:proofErr w:type="spellEnd"/>
-      <w:r>
-        <w:rPr>
-          <w:lang w:val="el-GR"/>
-        </w:rPr>
-        <w:t xml:space="preserve"> </w:t>
-      </w:r>
       <w:r>
         <w:rPr>
           <w:lang w:val="el-GR"/>
@@ -176,21 +122,7 @@
         <w:rPr>
           <w:lang w:val="el-GR"/>
         </w:rPr>
-        <w:t xml:space="preserve"> λ</w:t>
-      </w:r>
-      <w:proofErr w:type="spellStart"/>
-      <w:r>
-        <w:rPr>
-          <w:lang w:val="el-GR"/>
-        </w:rPr>
-        <w:t>οιπον</w:t>
-      </w:r>
-      <w:proofErr w:type="spellEnd"/>
-      <w:r>
-        <w:rPr>
-          <w:lang w:val="el-GR"/>
-        </w:rPr>
-        <w:t xml:space="preserve"> </w:t>
+        <w:t xml:space="preserve"> λοιπον </w:t>
       </w:r>
       <w:r>
         <w:rPr>
@@ -198,147 +130,67 @@
         </w:rPr>
         <w:t xml:space="preserve">: </w:t>
       </w:r>
+    </w:p>
+    <w:p>
+      <w:pPr>
+        <w:pStyle w:val="Textbody"/>
+        <w:rPr>
+          <w:lang w:val="el-GR"/>
+        </w:rPr>
+      </w:pPr>
       <w:r>
         <w:rPr>
           <w:lang w:val="el-GR"/>
         </w:rPr>
         <w:br/>
       </w:r>
-      <w:r>
-        <w:rPr>
-          <w:lang w:val="el-GR"/>
-        </w:rPr>
-        <w:br/>
-      </w:r>
-      <w:proofErr w:type="spellStart"/>
       <w:r>
         <w:rPr>
           <w:b/>
           <w:bCs/>
           <w:lang w:val="el-GR"/>
         </w:rPr>
-        <w:t>Pole</w:t>
-      </w:r>
-      <w:proofErr w:type="spellEnd"/>
+        <w:t>Pole Position : Andrea Kimi Antonelli -3.8</w:t>
+      </w:r>
       <w:r>
         <w:rPr>
           <w:b/>
           <w:bCs/>
           <w:lang w:val="el-GR"/>
         </w:rPr>
-        <w:t xml:space="preserve"> </w:t>
-      </w:r>
-      <w:proofErr w:type="spellStart"/>
+        <w:br/>
+      </w:r>
       <w:r>
         <w:rPr>
           <w:b/>
           <w:bCs/>
           <w:lang w:val="el-GR"/>
         </w:rPr>
-        <w:t>Position</w:t>
-      </w:r>
-      <w:proofErr w:type="spellEnd"/>
+        <w:t>Διαφορά πρώτου από τον δεύτερο: 0,0 - 0,1 : 2,8</w:t>
+      </w:r>
       <w:r>
         <w:rPr>
           <w:b/>
           <w:bCs/>
           <w:lang w:val="el-GR"/>
         </w:rPr>
-        <w:t xml:space="preserve"> : </w:t>
-      </w:r>
-      <w:proofErr w:type="spellStart"/>
+        <w:br/>
+        <w:t>Δίδυμο κορυφής : Άλλος συνδυασμός –</w:t>
+      </w:r>
       <w:r>
         <w:rPr>
           <w:b/>
           <w:bCs/>
           <w:lang w:val="el-GR"/>
         </w:rPr>
-        <w:t>Andrea</w:t>
-      </w:r>
-      <w:proofErr w:type="spellEnd"/>
+        <w:br/>
+      </w:r>
       <w:r>
         <w:rPr>
           <w:b/>
           <w:bCs/>
           <w:lang w:val="el-GR"/>
         </w:rPr>
-        <w:t xml:space="preserve"> </w:t>
-      </w:r>
-      <w:proofErr w:type="spellStart"/>
-      <w:r>
-        <w:rPr>
-          <w:b/>
-          <w:bCs/>
-          <w:lang w:val="el-GR"/>
-        </w:rPr>
-        <w:t>Kimi</w:t>
-      </w:r>
-      <w:proofErr w:type="spellEnd"/>
-      <w:r>
-        <w:rPr>
-          <w:b/>
-          <w:bCs/>
-          <w:lang w:val="el-GR"/>
-        </w:rPr>
-        <w:t xml:space="preserve"> </w:t>
-      </w:r>
-      <w:proofErr w:type="spellStart"/>
-      <w:r>
-        <w:rPr>
-          <w:b/>
-          <w:bCs/>
-          <w:lang w:val="el-GR"/>
-        </w:rPr>
-        <w:t>Antonelli</w:t>
-      </w:r>
-      <w:proofErr w:type="spellEnd"/>
-      <w:r>
-        <w:rPr>
-          <w:b/>
-          <w:bCs/>
-          <w:lang w:val="el-GR"/>
-        </w:rPr>
-        <w:t xml:space="preserve"> -3.8</w:t>
-      </w:r>
-      <w:r>
-        <w:rPr>
-          <w:b/>
-          <w:bCs/>
-          <w:lang w:val="el-GR"/>
-        </w:rPr>
-        <w:br/>
-      </w:r>
-      <w:r>
-        <w:rPr>
-          <w:b/>
-          <w:bCs/>
-          <w:lang w:val="el-GR"/>
-        </w:rPr>
-        <w:t>Διαφορά πρώτου από τον δεύτερο: 0,0 - 0,1 : 2,8</w:t>
-      </w:r>
-      <w:r>
-        <w:rPr>
-          <w:b/>
-          <w:bCs/>
-          <w:lang w:val="el-GR"/>
-        </w:rPr>
-        <w:br/>
-        <w:t>Δίδυμο κορυφής : Άλλος συνδυασμός –</w:t>
-      </w:r>
-      <w:r>
-        <w:rPr>
-          <w:b/>
-          <w:bCs/>
-          <w:lang w:val="el-GR"/>
-        </w:rPr>
-        <w:br/>
-      </w:r>
-      <w:r>
-        <w:rPr>
-          <w:b/>
-          <w:bCs/>
-          <w:lang w:val="el-GR"/>
-        </w:rPr>
         <w:t>Μονοθέσια με κατάταξη στον αγώνα κάτω από 17 - 2,</w:t>
       </w:r>
       <w:r>
@@ -375,56 +227,48 @@
         </w:rPr>
         <w:t>://</w:t>
       </w:r>
-      <w:proofErr w:type="spellStart"/>
       <w:r>
         <w:rPr>
           <w:lang w:val="de-DE"/>
         </w:rPr>
         <w:t>www</w:t>
       </w:r>
-      <w:proofErr w:type="spellEnd"/>
       <w:r>
         <w:rPr>
           <w:lang w:val="el-GR"/>
         </w:rPr>
         <w:t>.</w:t>
       </w:r>
-      <w:proofErr w:type="spellStart"/>
       <w:r>
         <w:rPr>
           <w:lang w:val="de-DE"/>
         </w:rPr>
         <w:t>youtube</w:t>
       </w:r>
-      <w:proofErr w:type="spellEnd"/>
       <w:r>
         <w:rPr>
           <w:lang w:val="el-GR"/>
         </w:rPr>
         <w:t>.</w:t>
       </w:r>
-      <w:proofErr w:type="spellStart"/>
       <w:r>
         <w:rPr>
           <w:lang w:val="de-DE"/>
         </w:rPr>
         <w:t>com</w:t>
       </w:r>
-      <w:proofErr w:type="spellEnd"/>
       <w:r>
         <w:rPr>
           <w:lang w:val="el-GR"/>
         </w:rPr>
         <w:t>/</w:t>
       </w:r>
-      <w:proofErr w:type="spellStart"/>
       <w:r>
         <w:rPr>
           <w:lang w:val="de-DE"/>
         </w:rPr>
         <w:t>watch</w:t>
       </w:r>
-      <w:proofErr w:type="spellEnd"/>
       <w:r>
         <w:rPr>
           <w:lang w:val="el-GR"/>
@@ -455,14 +299,12 @@
         </w:rPr>
         <w:t>56</w:t>
       </w:r>
-      <w:proofErr w:type="spellStart"/>
       <w:r>
         <w:rPr>
           <w:lang w:val="de-DE"/>
         </w:rPr>
         <w:t>UPPWRpQ</w:t>
       </w:r>
-      <w:proofErr w:type="spellEnd"/>
       <w:r>
         <w:rPr>
           <w:lang w:val="el-GR"/>
@@ -492,7 +334,7 @@
       <w:pPr>
         <w:pStyle w:val="Textbody"/>
         <w:rPr>
-          <w:lang w:val="de-DE"/>
+          <w:lang w:val="el-GR"/>
         </w:rPr>
       </w:pPr>
     </w:p>
@@ -500,7 +342,7 @@
       <w:pPr>
         <w:pStyle w:val="Textbody"/>
         <w:rPr>
-          <w:lang w:val="de-DE"/>
+          <w:lang w:val="el-GR"/>
         </w:rPr>
       </w:pPr>
     </w:p>
@@ -508,7 +350,7 @@
       <w:pPr>
         <w:pStyle w:val="Textbody"/>
         <w:rPr>
-          <w:lang w:val="de-DE"/>
+          <w:lang w:val="el-GR"/>
         </w:rPr>
       </w:pPr>
     </w:p>
@@ -517,39 +359,7 @@
         <w:pStyle w:val="Textbody"/>
       </w:pPr>
       <w:r>
-        <w:t xml:space="preserve">Από </w:t>
-      </w:r>
-      <w:proofErr w:type="spellStart"/>
-      <w:r>
-        <w:t>το</w:t>
-      </w:r>
-      <w:proofErr w:type="spellEnd"/>
-      <w:r>
-        <w:t xml:space="preserve"> F1 stories </w:t>
-      </w:r>
-      <w:proofErr w:type="spellStart"/>
-      <w:r>
-        <w:t>ήμουν</w:t>
-      </w:r>
-      <w:proofErr w:type="spellEnd"/>
-      <w:r>
-        <w:t xml:space="preserve"> ο </w:t>
-      </w:r>
-      <w:proofErr w:type="spellStart"/>
-      <w:r>
-        <w:t>Γιάννης</w:t>
-      </w:r>
-      <w:proofErr w:type="spellEnd"/>
-      <w:r>
-        <w:t xml:space="preserve"> </w:t>
-      </w:r>
-      <w:proofErr w:type="spellStart"/>
-      <w:r>
-        <w:t>Πουλικίδης</w:t>
-      </w:r>
-      <w:proofErr w:type="spellEnd"/>
-      <w:r>
-        <w:t>.</w:t>
+        <w:t>Από το F1 stories ήμουν ο Γιάννης Πουλικίδης.</w:t>
       </w:r>
     </w:p>
     <w:p>

</xml_diff>